<commit_message>
Updated codebook with note about _incl variables
</commit_message>
<xml_diff>
--- a/data/aa_data_wide_codebook_2024.docx
+++ b/data/aa_data_wide_codebook_2024.docx
@@ -25,7 +25,7 @@
                     </pic:cNvPicPr>
                   </pic:nvPicPr>
                   <pic:blipFill>
-                    <a:blip cstate="print" r:embed="rId8"/>
+                    <a:blip r:embed="rId7"/>
                     <a:stretch>
                       <a:fillRect/>
                     </a:stretch>
@@ -47,7 +47,7 @@
         </w:drawing>
       </w:r>
     </w:p>
-    <w:altChunk r:id="rId7"/>
+    <w:altChunk r:id="rId8"/>
     <w:sectPr>
       <w:type w:val="continuous"/>
       <w:pgSz w:w="11900" w:h="16840"/>

</xml_diff>